<commit_message>
Gork faction nerf after very first test game.
</commit_message>
<xml_diff>
--- a/Phase2/card-files/AO_early-alpha_test-cards/tOA_early-alpha_print-table_001.docx
+++ b/Phase2/card-files/AO_early-alpha_test-cards/tOA_early-alpha_print-table_001.docx
@@ -286,10 +286,10 @@
                 <w:noProof/>
               </w:rPr>
               <w:drawing>
-                <wp:inline distT="0" distB="0" distL="0" distR="0" wp14:anchorId="6FB5E40E" wp14:editId="4E7B6204">
-                  <wp:extent cx="2223770" cy="3096260"/>
-                  <wp:effectExtent l="0" t="0" r="5080" b="8890"/>
-                  <wp:docPr id="741436426" name="Picture 7"/>
+                <wp:inline distT="0" distB="0" distL="0" distR="0" wp14:anchorId="2123266C" wp14:editId="649C287F">
+                  <wp:extent cx="2219325" cy="3095625"/>
+                  <wp:effectExtent l="0" t="0" r="9525" b="9525"/>
+                  <wp:docPr id="1307374137" name="Picture 1"/>
                   <wp:cNvGraphicFramePr>
                     <a:graphicFrameLocks xmlns:a="http://schemas.openxmlformats.org/drawingml/2006/main" noChangeAspect="1"/>
                   </wp:cNvGraphicFramePr>
@@ -297,7 +297,7 @@
                     <a:graphicData uri="http://schemas.openxmlformats.org/drawingml/2006/picture">
                       <pic:pic xmlns:pic="http://schemas.openxmlformats.org/drawingml/2006/picture">
                         <pic:nvPicPr>
-                          <pic:cNvPr id="0" name="Picture 7"/>
+                          <pic:cNvPr id="0" name="Picture 1"/>
                           <pic:cNvPicPr>
                             <a:picLocks noChangeAspect="1" noChangeArrowheads="1"/>
                           </pic:cNvPicPr>
@@ -318,7 +318,7 @@
                         <pic:spPr bwMode="auto">
                           <a:xfrm>
                             <a:off x="0" y="0"/>
-                            <a:ext cx="2223770" cy="3096260"/>
+                            <a:ext cx="2219325" cy="3095625"/>
                           </a:xfrm>
                           <a:prstGeom prst="rect">
                             <a:avLst/>
@@ -414,10 +414,10 @@
                 <w:noProof/>
               </w:rPr>
               <w:drawing>
-                <wp:inline distT="0" distB="0" distL="0" distR="0" wp14:anchorId="52AE1831" wp14:editId="4A71AA7B">
-                  <wp:extent cx="2223770" cy="3096260"/>
-                  <wp:effectExtent l="0" t="0" r="5080" b="8890"/>
-                  <wp:docPr id="1796896886" name="Picture 9"/>
+                <wp:inline distT="0" distB="0" distL="0" distR="0" wp14:anchorId="4002A210" wp14:editId="2274598D">
+                  <wp:extent cx="2219325" cy="3095625"/>
+                  <wp:effectExtent l="0" t="0" r="9525" b="9525"/>
+                  <wp:docPr id="45974608" name="Picture 2"/>
                   <wp:cNvGraphicFramePr>
                     <a:graphicFrameLocks xmlns:a="http://schemas.openxmlformats.org/drawingml/2006/main" noChangeAspect="1"/>
                   </wp:cNvGraphicFramePr>
@@ -425,7 +425,7 @@
                     <a:graphicData uri="http://schemas.openxmlformats.org/drawingml/2006/picture">
                       <pic:pic xmlns:pic="http://schemas.openxmlformats.org/drawingml/2006/picture">
                         <pic:nvPicPr>
-                          <pic:cNvPr id="0" name="Picture 9"/>
+                          <pic:cNvPr id="0" name="Picture 2"/>
                           <pic:cNvPicPr>
                             <a:picLocks noChangeAspect="1" noChangeArrowheads="1"/>
                           </pic:cNvPicPr>
@@ -446,7 +446,7 @@
                         <pic:spPr bwMode="auto">
                           <a:xfrm>
                             <a:off x="0" y="0"/>
-                            <a:ext cx="2223770" cy="3096260"/>
+                            <a:ext cx="2219325" cy="3095625"/>
                           </a:xfrm>
                           <a:prstGeom prst="rect">
                             <a:avLst/>
@@ -535,10 +535,10 @@
                 <w:noProof/>
               </w:rPr>
               <w:drawing>
-                <wp:inline distT="0" distB="0" distL="0" distR="0" wp14:anchorId="11615F55" wp14:editId="63A09C7B">
-                  <wp:extent cx="2223770" cy="3096260"/>
-                  <wp:effectExtent l="0" t="0" r="5080" b="8890"/>
-                  <wp:docPr id="2028440851" name="Picture 11"/>
+                <wp:inline distT="0" distB="0" distL="0" distR="0" wp14:anchorId="35397B2A" wp14:editId="7F740F1A">
+                  <wp:extent cx="2219325" cy="3095625"/>
+                  <wp:effectExtent l="0" t="0" r="9525" b="9525"/>
+                  <wp:docPr id="2021861560" name="Picture 3"/>
                   <wp:cNvGraphicFramePr>
                     <a:graphicFrameLocks xmlns:a="http://schemas.openxmlformats.org/drawingml/2006/main" noChangeAspect="1"/>
                   </wp:cNvGraphicFramePr>
@@ -546,7 +546,7 @@
                     <a:graphicData uri="http://schemas.openxmlformats.org/drawingml/2006/picture">
                       <pic:pic xmlns:pic="http://schemas.openxmlformats.org/drawingml/2006/picture">
                         <pic:nvPicPr>
-                          <pic:cNvPr id="0" name="Picture 11"/>
+                          <pic:cNvPr id="0" name="Picture 3"/>
                           <pic:cNvPicPr>
                             <a:picLocks noChangeAspect="1" noChangeArrowheads="1"/>
                           </pic:cNvPicPr>
@@ -567,7 +567,7 @@
                         <pic:spPr bwMode="auto">
                           <a:xfrm>
                             <a:off x="0" y="0"/>
-                            <a:ext cx="2223770" cy="3096260"/>
+                            <a:ext cx="2219325" cy="3095625"/>
                           </a:xfrm>
                           <a:prstGeom prst="rect">
                             <a:avLst/>
@@ -629,10 +629,10 @@
                 <w:noProof/>
               </w:rPr>
               <w:drawing>
-                <wp:inline distT="0" distB="0" distL="0" distR="0" wp14:anchorId="6A3C78D9" wp14:editId="18467FC6">
-                  <wp:extent cx="2223770" cy="3096260"/>
-                  <wp:effectExtent l="0" t="0" r="5080" b="8890"/>
-                  <wp:docPr id="1929772042" name="Picture 12"/>
+                <wp:inline distT="0" distB="0" distL="0" distR="0" wp14:anchorId="533758B8" wp14:editId="2B588F09">
+                  <wp:extent cx="2219325" cy="3095625"/>
+                  <wp:effectExtent l="0" t="0" r="9525" b="9525"/>
+                  <wp:docPr id="768249316" name="Picture 11"/>
                   <wp:cNvGraphicFramePr>
                     <a:graphicFrameLocks xmlns:a="http://schemas.openxmlformats.org/drawingml/2006/main" noChangeAspect="1"/>
                   </wp:cNvGraphicFramePr>
@@ -640,7 +640,7 @@
                     <a:graphicData uri="http://schemas.openxmlformats.org/drawingml/2006/picture">
                       <pic:pic xmlns:pic="http://schemas.openxmlformats.org/drawingml/2006/picture">
                         <pic:nvPicPr>
-                          <pic:cNvPr id="0" name="Picture 12"/>
+                          <pic:cNvPr id="0" name="Picture 11"/>
                           <pic:cNvPicPr>
                             <a:picLocks noChangeAspect="1" noChangeArrowheads="1"/>
                           </pic:cNvPicPr>
@@ -661,7 +661,7 @@
                         <pic:spPr bwMode="auto">
                           <a:xfrm>
                             <a:off x="0" y="0"/>
-                            <a:ext cx="2223770" cy="3096260"/>
+                            <a:ext cx="2219325" cy="3095625"/>
                           </a:xfrm>
                           <a:prstGeom prst="rect">
                             <a:avLst/>
@@ -750,10 +750,10 @@
                 <w:noProof/>
               </w:rPr>
               <w:drawing>
-                <wp:inline distT="0" distB="0" distL="0" distR="0" wp14:anchorId="58E27BA0" wp14:editId="0DA3DD8F">
-                  <wp:extent cx="2223770" cy="3096260"/>
-                  <wp:effectExtent l="0" t="0" r="5080" b="8890"/>
-                  <wp:docPr id="604242292" name="Picture 17"/>
+                <wp:inline distT="0" distB="0" distL="0" distR="0" wp14:anchorId="2C3FC18C" wp14:editId="38623A04">
+                  <wp:extent cx="2219325" cy="3095625"/>
+                  <wp:effectExtent l="0" t="0" r="9525" b="9525"/>
+                  <wp:docPr id="269618744" name="Picture 10"/>
                   <wp:cNvGraphicFramePr>
                     <a:graphicFrameLocks xmlns:a="http://schemas.openxmlformats.org/drawingml/2006/main" noChangeAspect="1"/>
                   </wp:cNvGraphicFramePr>
@@ -761,7 +761,7 @@
                     <a:graphicData uri="http://schemas.openxmlformats.org/drawingml/2006/picture">
                       <pic:pic xmlns:pic="http://schemas.openxmlformats.org/drawingml/2006/picture">
                         <pic:nvPicPr>
-                          <pic:cNvPr id="0" name="Picture 17"/>
+                          <pic:cNvPr id="0" name="Picture 10"/>
                           <pic:cNvPicPr>
                             <a:picLocks noChangeAspect="1" noChangeArrowheads="1"/>
                           </pic:cNvPicPr>
@@ -782,7 +782,7 @@
                         <pic:spPr bwMode="auto">
                           <a:xfrm>
                             <a:off x="0" y="0"/>
-                            <a:ext cx="2223770" cy="3096260"/>
+                            <a:ext cx="2219325" cy="3095625"/>
                           </a:xfrm>
                           <a:prstGeom prst="rect">
                             <a:avLst/>
@@ -877,10 +877,10 @@
                 <w:noProof/>
               </w:rPr>
               <w:drawing>
-                <wp:inline distT="0" distB="0" distL="0" distR="0" wp14:anchorId="63412B45" wp14:editId="23A60A78">
-                  <wp:extent cx="2223770" cy="3096260"/>
-                  <wp:effectExtent l="0" t="0" r="5080" b="8890"/>
-                  <wp:docPr id="305954805" name="Picture 19"/>
+                <wp:inline distT="0" distB="0" distL="0" distR="0" wp14:anchorId="1840EF05" wp14:editId="7E73B7E1">
+                  <wp:extent cx="2219325" cy="3095625"/>
+                  <wp:effectExtent l="0" t="0" r="9525" b="9525"/>
+                  <wp:docPr id="1948388495" name="Picture 9"/>
                   <wp:cNvGraphicFramePr>
                     <a:graphicFrameLocks xmlns:a="http://schemas.openxmlformats.org/drawingml/2006/main" noChangeAspect="1"/>
                   </wp:cNvGraphicFramePr>
@@ -888,7 +888,7 @@
                     <a:graphicData uri="http://schemas.openxmlformats.org/drawingml/2006/picture">
                       <pic:pic xmlns:pic="http://schemas.openxmlformats.org/drawingml/2006/picture">
                         <pic:nvPicPr>
-                          <pic:cNvPr id="0" name="Picture 19"/>
+                          <pic:cNvPr id="0" name="Picture 9"/>
                           <pic:cNvPicPr>
                             <a:picLocks noChangeAspect="1" noChangeArrowheads="1"/>
                           </pic:cNvPicPr>
@@ -909,7 +909,7 @@
                         <pic:spPr bwMode="auto">
                           <a:xfrm>
                             <a:off x="0" y="0"/>
-                            <a:ext cx="2223770" cy="3096260"/>
+                            <a:ext cx="2219325" cy="3095625"/>
                           </a:xfrm>
                           <a:prstGeom prst="rect">
                             <a:avLst/>
@@ -938,7 +938,7 @@
                 <w:noProof/>
               </w:rPr>
               <w:drawing>
-                <wp:inline distT="0" distB="0" distL="0" distR="0" wp14:anchorId="209B9EC3" wp14:editId="6FF84CC5">
+                <wp:inline distT="0" distB="0" distL="0" distR="0" wp14:anchorId="209B9EC3" wp14:editId="05FE0E35">
                   <wp:extent cx="2225040" cy="3093720"/>
                   <wp:effectExtent l="0" t="0" r="3810" b="0"/>
                   <wp:docPr id="1689347638" name="Picture 24"/>
@@ -1005,10 +1005,10 @@
                 <w:noProof/>
               </w:rPr>
               <w:drawing>
-                <wp:inline distT="0" distB="0" distL="0" distR="0" wp14:anchorId="737F9947" wp14:editId="49843529">
-                  <wp:extent cx="2225040" cy="3093720"/>
-                  <wp:effectExtent l="0" t="0" r="3810" b="0"/>
-                  <wp:docPr id="1336986321" name="Picture 25"/>
+                <wp:inline distT="0" distB="0" distL="0" distR="0" wp14:anchorId="2F57FFCA" wp14:editId="006A384A">
+                  <wp:extent cx="2219325" cy="3095625"/>
+                  <wp:effectExtent l="0" t="0" r="9525" b="9525"/>
+                  <wp:docPr id="1770911340" name="Picture 8"/>
                   <wp:cNvGraphicFramePr>
                     <a:graphicFrameLocks xmlns:a="http://schemas.openxmlformats.org/drawingml/2006/main" noChangeAspect="1"/>
                   </wp:cNvGraphicFramePr>
@@ -1016,13 +1016,13 @@
                     <a:graphicData uri="http://schemas.openxmlformats.org/drawingml/2006/picture">
                       <pic:pic xmlns:pic="http://schemas.openxmlformats.org/drawingml/2006/picture">
                         <pic:nvPicPr>
-                          <pic:cNvPr id="0" name="Picture 25"/>
+                          <pic:cNvPr id="0" name="Picture 8"/>
                           <pic:cNvPicPr>
                             <a:picLocks noChangeAspect="1" noChangeArrowheads="1"/>
                           </pic:cNvPicPr>
                         </pic:nvPicPr>
                         <pic:blipFill>
-                          <a:blip r:embed="rId9" cstate="print">
+                          <a:blip r:embed="rId7" cstate="print">
                             <a:extLst>
                               <a:ext uri="{28A0092B-C50C-407E-A947-70E740481C1C}">
                                 <a14:useLocalDpi xmlns:a14="http://schemas.microsoft.com/office/drawing/2010/main" val="0"/>
@@ -1037,7 +1037,7 @@
                         <pic:spPr bwMode="auto">
                           <a:xfrm>
                             <a:off x="0" y="0"/>
-                            <a:ext cx="2225040" cy="3093720"/>
+                            <a:ext cx="2219325" cy="3095625"/>
                           </a:xfrm>
                           <a:prstGeom prst="rect">
                             <a:avLst/>
@@ -1065,7 +1065,7 @@
                 <w:noProof/>
               </w:rPr>
               <w:drawing>
-                <wp:inline distT="0" distB="0" distL="0" distR="0" wp14:anchorId="4387555F" wp14:editId="3A7F87A9">
+                <wp:inline distT="0" distB="0" distL="0" distR="0" wp14:anchorId="4387555F" wp14:editId="1ADF37BE">
                   <wp:extent cx="2225040" cy="3093720"/>
                   <wp:effectExtent l="0" t="0" r="3810" b="0"/>
                   <wp:docPr id="485758389" name="Picture 26"/>
@@ -1126,10 +1126,10 @@
                 <w:noProof/>
               </w:rPr>
               <w:drawing>
-                <wp:inline distT="0" distB="0" distL="0" distR="0" wp14:anchorId="0085A5D2" wp14:editId="4B84A374">
-                  <wp:extent cx="2225040" cy="3093720"/>
-                  <wp:effectExtent l="0" t="0" r="3810" b="0"/>
-                  <wp:docPr id="117684608" name="Picture 27"/>
+                <wp:inline distT="0" distB="0" distL="0" distR="0" wp14:anchorId="4DD4E09E" wp14:editId="7FC3F01B">
+                  <wp:extent cx="2219325" cy="3095625"/>
+                  <wp:effectExtent l="0" t="0" r="9525" b="9525"/>
+                  <wp:docPr id="72891310" name="Picture 7"/>
                   <wp:cNvGraphicFramePr>
                     <a:graphicFrameLocks xmlns:a="http://schemas.openxmlformats.org/drawingml/2006/main" noChangeAspect="1"/>
                   </wp:cNvGraphicFramePr>
@@ -1137,13 +1137,13 @@
                     <a:graphicData uri="http://schemas.openxmlformats.org/drawingml/2006/picture">
                       <pic:pic xmlns:pic="http://schemas.openxmlformats.org/drawingml/2006/picture">
                         <pic:nvPicPr>
-                          <pic:cNvPr id="0" name="Picture 27"/>
+                          <pic:cNvPr id="0" name="Picture 7"/>
                           <pic:cNvPicPr>
                             <a:picLocks noChangeAspect="1" noChangeArrowheads="1"/>
                           </pic:cNvPicPr>
                         </pic:nvPicPr>
                         <pic:blipFill>
-                          <a:blip r:embed="rId9" cstate="print">
+                          <a:blip r:embed="rId7" cstate="print">
                             <a:extLst>
                               <a:ext uri="{28A0092B-C50C-407E-A947-70E740481C1C}">
                                 <a14:useLocalDpi xmlns:a14="http://schemas.microsoft.com/office/drawing/2010/main" val="0"/>
@@ -1158,7 +1158,7 @@
                         <pic:spPr bwMode="auto">
                           <a:xfrm>
                             <a:off x="0" y="0"/>
-                            <a:ext cx="2225040" cy="3093720"/>
+                            <a:ext cx="2219325" cy="3095625"/>
                           </a:xfrm>
                           <a:prstGeom prst="rect">
                             <a:avLst/>
@@ -1220,10 +1220,10 @@
                 <w:noProof/>
               </w:rPr>
               <w:drawing>
-                <wp:inline distT="0" distB="0" distL="0" distR="0" wp14:anchorId="79E2410F" wp14:editId="47C0D3A8">
-                  <wp:extent cx="2225040" cy="3093720"/>
-                  <wp:effectExtent l="0" t="0" r="3810" b="0"/>
-                  <wp:docPr id="1450595572" name="Picture 28"/>
+                <wp:inline distT="0" distB="0" distL="0" distR="0" wp14:anchorId="133E686A" wp14:editId="079BD195">
+                  <wp:extent cx="2219325" cy="3095625"/>
+                  <wp:effectExtent l="0" t="0" r="9525" b="9525"/>
+                  <wp:docPr id="1631492107" name="Picture 6"/>
                   <wp:cNvGraphicFramePr>
                     <a:graphicFrameLocks xmlns:a="http://schemas.openxmlformats.org/drawingml/2006/main" noChangeAspect="1"/>
                   </wp:cNvGraphicFramePr>
@@ -1231,13 +1231,13 @@
                     <a:graphicData uri="http://schemas.openxmlformats.org/drawingml/2006/picture">
                       <pic:pic xmlns:pic="http://schemas.openxmlformats.org/drawingml/2006/picture">
                         <pic:nvPicPr>
-                          <pic:cNvPr id="0" name="Picture 28"/>
+                          <pic:cNvPr id="0" name="Picture 6"/>
                           <pic:cNvPicPr>
                             <a:picLocks noChangeAspect="1" noChangeArrowheads="1"/>
                           </pic:cNvPicPr>
                         </pic:nvPicPr>
                         <pic:blipFill>
-                          <a:blip r:embed="rId9" cstate="print">
+                          <a:blip r:embed="rId7" cstate="print">
                             <a:extLst>
                               <a:ext uri="{28A0092B-C50C-407E-A947-70E740481C1C}">
                                 <a14:useLocalDpi xmlns:a14="http://schemas.microsoft.com/office/drawing/2010/main" val="0"/>
@@ -1252,7 +1252,7 @@
                         <pic:spPr bwMode="auto">
                           <a:xfrm>
                             <a:off x="0" y="0"/>
-                            <a:ext cx="2225040" cy="3093720"/>
+                            <a:ext cx="2219325" cy="3095625"/>
                           </a:xfrm>
                           <a:prstGeom prst="rect">
                             <a:avLst/>
@@ -1280,7 +1280,7 @@
                 <w:noProof/>
               </w:rPr>
               <w:drawing>
-                <wp:inline distT="0" distB="0" distL="0" distR="0" wp14:anchorId="6E166F06" wp14:editId="5BAE4603">
+                <wp:inline distT="0" distB="0" distL="0" distR="0" wp14:anchorId="6E166F06" wp14:editId="6CAB6DAF">
                   <wp:extent cx="2225040" cy="3093720"/>
                   <wp:effectExtent l="0" t="0" r="3810" b="0"/>
                   <wp:docPr id="1146009879" name="Picture 29"/>
@@ -1341,10 +1341,10 @@
                 <w:noProof/>
               </w:rPr>
               <w:drawing>
-                <wp:inline distT="0" distB="0" distL="0" distR="0" wp14:anchorId="1DF67877" wp14:editId="5876ABEB">
-                  <wp:extent cx="2225040" cy="3093720"/>
-                  <wp:effectExtent l="0" t="0" r="3810" b="0"/>
-                  <wp:docPr id="423519258" name="Picture 30"/>
+                <wp:inline distT="0" distB="0" distL="0" distR="0" wp14:anchorId="1E474BAA" wp14:editId="7231698E">
+                  <wp:extent cx="2219325" cy="3095625"/>
+                  <wp:effectExtent l="0" t="0" r="9525" b="9525"/>
+                  <wp:docPr id="266285193" name="Picture 5"/>
                   <wp:cNvGraphicFramePr>
                     <a:graphicFrameLocks xmlns:a="http://schemas.openxmlformats.org/drawingml/2006/main" noChangeAspect="1"/>
                   </wp:cNvGraphicFramePr>
@@ -1352,13 +1352,13 @@
                     <a:graphicData uri="http://schemas.openxmlformats.org/drawingml/2006/picture">
                       <pic:pic xmlns:pic="http://schemas.openxmlformats.org/drawingml/2006/picture">
                         <pic:nvPicPr>
-                          <pic:cNvPr id="0" name="Picture 30"/>
+                          <pic:cNvPr id="0" name="Picture 5"/>
                           <pic:cNvPicPr>
                             <a:picLocks noChangeAspect="1" noChangeArrowheads="1"/>
                           </pic:cNvPicPr>
                         </pic:nvPicPr>
                         <pic:blipFill>
-                          <a:blip r:embed="rId9" cstate="print">
+                          <a:blip r:embed="rId7" cstate="print">
                             <a:extLst>
                               <a:ext uri="{28A0092B-C50C-407E-A947-70E740481C1C}">
                                 <a14:useLocalDpi xmlns:a14="http://schemas.microsoft.com/office/drawing/2010/main" val="0"/>
@@ -1373,7 +1373,7 @@
                         <pic:spPr bwMode="auto">
                           <a:xfrm>
                             <a:off x="0" y="0"/>
-                            <a:ext cx="2225040" cy="3093720"/>
+                            <a:ext cx="2219325" cy="3095625"/>
                           </a:xfrm>
                           <a:prstGeom prst="rect">
                             <a:avLst/>
@@ -1408,7 +1408,7 @@
                 <w:noProof/>
               </w:rPr>
               <w:drawing>
-                <wp:inline distT="0" distB="0" distL="0" distR="0" wp14:anchorId="0FCE5D63" wp14:editId="31BDC68C">
+                <wp:inline distT="0" distB="0" distL="0" distR="0" wp14:anchorId="0FCE5D63" wp14:editId="0D9A440D">
                   <wp:extent cx="2225040" cy="3093720"/>
                   <wp:effectExtent l="0" t="0" r="3810" b="0"/>
                   <wp:docPr id="1839310794" name="Picture 31"/>
@@ -1468,10 +1468,10 @@
                 <w:noProof/>
               </w:rPr>
               <w:drawing>
-                <wp:inline distT="0" distB="0" distL="0" distR="0" wp14:anchorId="6B151519" wp14:editId="64CD4430">
-                  <wp:extent cx="2225040" cy="3093720"/>
-                  <wp:effectExtent l="0" t="0" r="3810" b="0"/>
-                  <wp:docPr id="327293931" name="Picture 32"/>
+                <wp:inline distT="0" distB="0" distL="0" distR="0" wp14:anchorId="2362DA8D" wp14:editId="5F0CEAD8">
+                  <wp:extent cx="2219325" cy="3095625"/>
+                  <wp:effectExtent l="0" t="0" r="9525" b="9525"/>
+                  <wp:docPr id="1162946766" name="Picture 4"/>
                   <wp:cNvGraphicFramePr>
                     <a:graphicFrameLocks xmlns:a="http://schemas.openxmlformats.org/drawingml/2006/main" noChangeAspect="1"/>
                   </wp:cNvGraphicFramePr>
@@ -1479,13 +1479,13 @@
                     <a:graphicData uri="http://schemas.openxmlformats.org/drawingml/2006/picture">
                       <pic:pic xmlns:pic="http://schemas.openxmlformats.org/drawingml/2006/picture">
                         <pic:nvPicPr>
-                          <pic:cNvPr id="0" name="Picture 32"/>
+                          <pic:cNvPr id="0" name="Picture 4"/>
                           <pic:cNvPicPr>
                             <a:picLocks noChangeAspect="1" noChangeArrowheads="1"/>
                           </pic:cNvPicPr>
                         </pic:nvPicPr>
                         <pic:blipFill>
-                          <a:blip r:embed="rId9" cstate="print">
+                          <a:blip r:embed="rId7" cstate="print">
                             <a:extLst>
                               <a:ext uri="{28A0092B-C50C-407E-A947-70E740481C1C}">
                                 <a14:useLocalDpi xmlns:a14="http://schemas.microsoft.com/office/drawing/2010/main" val="0"/>
@@ -1500,7 +1500,7 @@
                         <pic:spPr bwMode="auto">
                           <a:xfrm>
                             <a:off x="0" y="0"/>
-                            <a:ext cx="2225040" cy="3093720"/>
+                            <a:ext cx="2219325" cy="3095625"/>
                           </a:xfrm>
                           <a:prstGeom prst="rect">
                             <a:avLst/>
@@ -1529,7 +1529,7 @@
                 <w:noProof/>
               </w:rPr>
               <w:drawing>
-                <wp:inline distT="0" distB="0" distL="0" distR="0" wp14:anchorId="02B2AD37" wp14:editId="4FED7C7A">
+                <wp:inline distT="0" distB="0" distL="0" distR="0" wp14:anchorId="02B2AD37" wp14:editId="3BC71211">
                   <wp:extent cx="2225040" cy="3093720"/>
                   <wp:effectExtent l="0" t="0" r="3810" b="0"/>
                   <wp:docPr id="1076478994" name="Picture 33"/>
@@ -1613,7 +1613,7 @@
                           </pic:cNvPicPr>
                         </pic:nvPicPr>
                         <pic:blipFill>
-                          <a:blip r:embed="rId10" cstate="print">
+                          <a:blip r:embed="rId9" cstate="print">
                             <a:extLst>
                               <a:ext uri="{28A0092B-C50C-407E-A947-70E740481C1C}">
                                 <a14:useLocalDpi xmlns:a14="http://schemas.microsoft.com/office/drawing/2010/main" val="0"/>
@@ -1673,7 +1673,7 @@
                           </pic:cNvPicPr>
                         </pic:nvPicPr>
                         <pic:blipFill>
-                          <a:blip r:embed="rId11" cstate="print">
+                          <a:blip r:embed="rId10" cstate="print">
                             <a:extLst>
                               <a:ext uri="{28A0092B-C50C-407E-A947-70E740481C1C}">
                                 <a14:useLocalDpi xmlns:a14="http://schemas.microsoft.com/office/drawing/2010/main" val="0"/>
@@ -1734,7 +1734,7 @@
                           </pic:cNvPicPr>
                         </pic:nvPicPr>
                         <pic:blipFill>
-                          <a:blip r:embed="rId10" cstate="print">
+                          <a:blip r:embed="rId9" cstate="print">
                             <a:extLst>
                               <a:ext uri="{28A0092B-C50C-407E-A947-70E740481C1C}">
                                 <a14:useLocalDpi xmlns:a14="http://schemas.microsoft.com/office/drawing/2010/main" val="0"/>
@@ -1778,7 +1778,7 @@
       </w:pPr>
     </w:p>
     <w:sectPr>
-      <w:pgSz w:w="11906" w:h="16838"/>
+      <w:pgSz w:w="11906" w:h="16838" w:code="9"/>
       <w:pgMar w:top="567" w:right="567" w:bottom="284" w:left="567" w:header="709" w:footer="709" w:gutter="0"/>
       <w:cols w:space="708"/>
       <w:docGrid w:linePitch="360"/>

</xml_diff>